<commit_message>
Aligne la politique de confidentialité et note la limite de l'offre Supabase
Le fichier Word et la page publiée reprennent le paragraphe « Localisation »
de la version texte ; date portée au 8 octobre 2026 et libellé « Parrainage
confirmé » dans les trois versions.

La protection contre les mots de passe compromis est réservée à l'offre Pro
de Supabase : notée comme non applicable pour l'instant dans le suivi.

Co-Authored-By: Claude Opus 5.5 <noreply@anthropic.com>
Claude-Session: https://claude.ai/code/session_01YRQtDBFY5ETahyVK8qjRj3
</commit_message>
<xml_diff>
--- a/docs/politique-de-confidentialite.docx
+++ b/docs/politique-de-confidentialite.docx
@@ -38,7 +38,7 @@
           <w:color w:val="4A3F2E"/>
           <w:sz w:val="21"/>
         </w:rPr>
-        <w:t>Dernière mise à jour : 24 août 2026</w:t>
+        <w:t>Dernière mise à jour : 8 octobre 2026</w:t>
       </w:r>
     </w:p>
     <w:p>
@@ -162,7 +162,7 @@
           <w:color w:val="2B2620"/>
           <w:sz w:val="22"/>
         </w:rPr>
-        <w:t>Lignée spirituelle (foyer, nom du moqaddam, année, zawiya) et statut « Mouqaddam vérifié » (silsila d'ijaza) sont privés par défaut. Ils ne servent à la mise en relation avec d'autres disciples que si vous l'activez explicitement — jamais d'annuaire public, jamais d'export. Toute consultation par un autre mouqaddam dans le cadre d'un parrainage est journalisée à des fins d'audit.</w:t>
+        <w:t>Lignée spirituelle (foyer, nom du moqaddam, année, zawiya) et statut « Parrainage confirmé » (silsila d'ijaza) sont privés par défaut. Ils ne servent à la mise en relation avec d'autres disciples que si vous l'activez explicitement — jamais d'annuaire public, jamais d'export. Toute consultation par un autre mouqaddam dans le cadre d'un parrainage est journalisée à des fins d'audit.</w:t>
       </w:r>
     </w:p>
     <w:p>
@@ -242,6 +242,28 @@
           <w:color w:val="4A3F2E"/>
           <w:sz w:val="24"/>
         </w:rPr>
+        <w:t>Localisation</w:t>
+      </w:r>
+    </w:p>
+    <w:p>
+      <w:pPr>
+        <w:spacing w:after="160"/>
+      </w:pPr>
+      <w:r>
+        <w:t>La fonction « La Hadra la plus proche » demande, uniquement quand vous l'ouvrez, la position approximative de votre appareil pour classer les zawiyas par distance. Ce calcul est fait sur votre téléphone : votre position n'est ni enregistrée, ni envoyée à nos serveurs, ni partagée. Vous pouvez refuser cette autorisation ; le reste de l'application fonctionne sans elle.</w:t>
+      </w:r>
+    </w:p>
+    <w:p>
+      <w:pPr>
+        <w:pStyle w:val="Heading2"/>
+        <w:spacing w:before="200" w:after="80"/>
+      </w:pPr>
+      <w:r>
+        <w:rPr>
+          <w:caps/>
+          <w:color w:val="4A3F2E"/>
+          <w:sz w:val="24"/>
+        </w:rPr>
         <w:t>Ce que nous ne collectons pas</w:t>
       </w:r>
     </w:p>
@@ -250,7 +272,7 @@
         <w:spacing w:after="160"/>
       </w:pPr>
       <w:r>
-        <w:t>Aucun outil d'analyse d'usage ou de publicité tiers, aucun traceur marketing, aucune géolocalisation.</w:t>
+        <w:t>Aucun outil d'analyse d'usage ou de publicité tiers, aucun traceur marketing, aucun suivi de votre position.</w:t>
       </w:r>
     </w:p>
     <w:p>

</xml_diff>

<commit_message>
Mentionne le signalement et le blocage dans la politique de confidentialité
Nouvelle rubrique « Signalement et blocage » dans les trois versions (page
publiée, .md, .docx) : un message signalé est transmis à la modération avec
le nom de son auteur puis effacé à la clôture ; un blocage est enregistré
côté serveur et reste privé. Date portée au 11 octobre 2026.

Ajoute l'icône 512 × 512 demandée par la fiche Play Store.

Co-Authored-By: Claude Opus 5.5 <noreply@anthropic.com>
Claude-Session: https://claude.ai/code/session_01YRQtDBFY5ETahyVK8qjRj3
</commit_message>
<xml_diff>
--- a/docs/politique-de-confidentialite.docx
+++ b/docs/politique-de-confidentialite.docx
@@ -38,7 +38,7 @@
           <w:color w:val="4A3F2E"/>
           <w:sz w:val="21"/>
         </w:rPr>
-        <w:t>Dernière mise à jour : 8 octobre 2026</w:t>
+        <w:t>Dernière mise à jour : 11 octobre 2026</w:t>
       </w:r>
     </w:p>
     <w:p>
@@ -185,6 +185,36 @@
       </w:pPr>
       <w:r>
         <w:t>Publications du fil d'actualité, commentaires, likes, messages privés, groupes et leurs membres — visibles selon les réglages de confidentialité du groupe ou de la conversation concernée.</w:t>
+      </w:r>
+    </w:p>
+    <w:p>
+      <w:pPr>
+        <w:pStyle w:val="Heading2"/>
+        <w:spacing w:before="200" w:after="80"/>
+      </w:pPr>
+      <w:r>
+        <w:rPr>
+          <w:caps/>
+          <w:color w:val="4A3F2E"/>
+          <w:sz w:val="24"/>
+        </w:rPr>
+        <w:t>Signalement et blocage</w:t>
+      </w:r>
+    </w:p>
+    <w:p>
+      <w:pPr>
+        <w:spacing w:after="160"/>
+      </w:pPr>
+      <w:r>
+        <w:t>Si vous signalez un message de groupe ou un message privé, une copie de ce message et le nom de son auteur sont transmis à la modération. Elle ne lit rien d'autre de la discussion. Cette copie est effacée dès que le signalement est traité.</w:t>
+      </w:r>
+    </w:p>
+    <w:p>
+      <w:pPr>
+        <w:spacing w:after="160"/>
+      </w:pPr>
+      <w:r>
+        <w:t>Si vous bloquez un disciple, ce blocage est enregistré sur nos serveurs pour être appliqué : il ne peut plus vous écrire et vous ne voyez plus ce qu'il écrit. Il reste privé ; la personne bloquée n'en est pas informée, et vous pouvez l'annuler à tout moment.</w:t>
       </w:r>
     </w:p>
     <w:p>

</xml_diff>